<commit_message>
Proposta Surcin: alinha preço às opções Essencial e Completa da precificação v2
Co-Authored-By: Claude Opus 5.5 (1M context) <noreply@anthropic.com>
Claude-Session: https://claude.ai/code/session_0127xFh2xB8HoQ18BDMAY2QJ
</commit_message>
<xml_diff>
--- a/proposta-surcin/02-estrutura-organizacional-hipotese.docx
+++ b/proposta-surcin/02-estrutura-organizacional-hipotese.docx
@@ -52,7 +52,7 @@
               <w:rPr>
                 <w:sz w:val="20"/>
               </w:rPr>
-              <w:t>Este é um ponto de partida para conversa, não uma recomendação final. Ainda não se sabe quantas pessoas trabalham no escritório nem como as tarefas estão divididas hoje. A versão recomendada só sai depois das entrevistas com os funcionários (Etapa 1 da proposta).</w:t>
+              <w:t>Este é um ponto de partida para conversa, não uma recomendação final. Ainda não se sabe quantas pessoas trabalham no escritório nem como as tarefas estão divididas hoje. A versão recomendada só sai depois das entrevistas com os funcionários (Etapas 1 e 2 da proposta).</w:t>
             </w:r>
           </w:p>
         </w:tc>
@@ -1297,7 +1297,7 @@
         <w:pStyle w:val="Heading1"/>
       </w:pPr>
       <w:r>
-        <w:t>7. Entregável final desta frente (Etapa 1)</w:t>
+        <w:t>7. Entregável final desta frente (Etapa 2 da proposta)</w:t>
       </w:r>
     </w:p>
     <w:p>

</xml_diff>